<commit_message>
Clase 09: notebooks de practica, consignas actualizadas y retiro del datathon de Clase 08
Agrega practica09-logistica y practica09-marketing, actualiza consignas,
metadata y historico de Logistica, y elimina los archivos del datathon de
Clase 08 que ya no se usan. Ignora la carpeta _docente del datathon de Clase 09.

Co-Authored-By: Claude Sonnet 5.5 <noreply@anthropic.com>
</commit_message>
<xml_diff>
--- a/Clase 09 - Ejercicio/Dataset - Logistica/Metadata - Logistica.docx
+++ b/Clase 09 - Ejercicio/Dataset - Logistica/Metadata - Logistica.docx
@@ -177,6 +177,56 @@
           <w:szCs w:val="19"/>
         </w:rPr>
         <w:t xml:space="preserve">Hoy todos los pedidos salen con el courier estándar. En cada lote, el área tiene que decidir cuáles de los pedidos que están por salir conviene pasar a premium.</w:t>
+      </w:r>
+    </w:p>
+    <w:p>
+      <w:pPr>
+        <w:keepNext/>
+        <w:spacing w:after="60" w:before="150"/>
+      </w:pPr>
+      <w:r>
+        <w:rPr>
+          <w:rFonts w:ascii="Arial" w:cs="Arial" w:eastAsia="Arial" w:hAnsi="Arial"/>
+          <w:b/>
+          <w:bCs/>
+          <w:color w:val="111111"/>
+          <w:spacing w:val="24"/>
+          <w:sz w:val="16"/>
+          <w:szCs w:val="16"/>
+        </w:rPr>
+        <w:t xml:space="preserve">EL CUPO DE PREMIUM</w:t>
+      </w:r>
+    </w:p>
+    <w:p>
+      <w:pPr>
+        <w:spacing w:after="80" w:line="252"/>
+      </w:pPr>
+      <w:r>
+        <w:rPr>
+          <w:rFonts w:ascii="Arial" w:cs="Arial" w:eastAsia="Arial" w:hAnsi="Arial"/>
+          <w:color w:val="111111"/>
+          <w:sz w:val="19"/>
+          <w:szCs w:val="19"/>
+        </w:rPr>
+        <w:t xml:space="preserve">El contrato con el courier premium fija un máximo de 25 pedidos por lote. Es un límite del negocio y se aplica al lote completo: solo 25 pedidos pueden salir por premium en total, aunque haya más con riesgo de atraso. El resto sale con el courier estándar. Los pedidos de </w:t>
+      </w:r>
+      <w:r>
+        <w:rPr>
+          <w:rFonts w:ascii="Consolas" w:cs="Consolas" w:eastAsia="Consolas" w:hAnsi="Consolas"/>
+          <w:color w:val="111111"/>
+          <w:sz w:val="18"/>
+          <w:szCs w:val="18"/>
+        </w:rPr>
+        <w:t xml:space="preserve">casos_nuevos.csv</w:t>
+      </w:r>
+      <w:r>
+        <w:rPr>
+          <w:rFonts w:ascii="Arial" w:cs="Arial" w:eastAsia="Arial" w:hAnsi="Arial"/>
+          <w:color w:val="111111"/>
+          <w:sz w:val="19"/>
+          <w:szCs w:val="19"/>
+        </w:rPr>
+        <w:t xml:space="preserve"> forman un lote.</w:t>
       </w:r>
     </w:p>
     <w:p>
@@ -2545,6 +2595,363 @@
           <w:szCs w:val="18"/>
         </w:rPr>
         <w:t xml:space="preserve">“Armame 3 slides: cada una con un título que diga la conclusión, un gráfico y una frase de cierre. Después hacé de público y hacime preguntas.”</w:t>
+      </w:r>
+    </w:p>
+    <w:p>
+      <w:pPr>
+        <w:keepNext/>
+        <w:pageBreakBefore/>
+        <w:pBdr>
+          <w:bottom w:val="single" w:color="111111" w:sz="18" w:space="4"/>
+        </w:pBdr>
+        <w:spacing w:after="100" w:before="0"/>
+      </w:pPr>
+      <w:r>
+        <w:rPr>
+          <w:rFonts w:ascii="Arial" w:cs="Arial" w:eastAsia="Arial" w:hAnsi="Arial"/>
+          <w:b/>
+          <w:bCs/>
+          <w:color w:val="111111"/>
+          <w:sz w:val="36"/>
+          <w:szCs w:val="36"/>
+        </w:rPr>
+        <w:t xml:space="preserve">Preguntas para encontrar patrones</w:t>
+      </w:r>
+    </w:p>
+    <w:p>
+      <w:pPr>
+        <w:spacing w:after="60" w:before="80" w:line="262"/>
+      </w:pPr>
+      <w:r>
+        <w:rPr>
+          <w:rFonts w:ascii="Arial" w:cs="Arial" w:eastAsia="Arial" w:hAnsi="Arial"/>
+          <w:color w:val="111111"/>
+          <w:sz w:val="19"/>
+          <w:szCs w:val="19"/>
+        </w:rPr>
+        <w:t xml:space="preserve">Un patrón es un grupo de casos donde el resultado se comporta distinto del resto. No se encuentra mirando promedios generales sino comparando grupos. Estas son preguntas para hacerse mientras exploran, y también para pasarle a Claude.</w:t>
+      </w:r>
+    </w:p>
+    <w:p>
+      <w:pPr>
+        <w:keepLines/>
+        <w:spacing w:after="50" w:before="120" w:line="262"/>
+      </w:pPr>
+      <w:r>
+        <w:rPr>
+          <w:rFonts w:ascii="Arial" w:cs="Arial" w:eastAsia="Arial" w:hAnsi="Arial"/>
+          <w:b/>
+          <w:bCs/>
+          <w:color w:val="111111"/>
+          <w:sz w:val="19"/>
+          <w:szCs w:val="19"/>
+        </w:rPr>
+        <w:t xml:space="preserve">1. ¿En qué grupos cambia la proporción de 1?</w:t>
+      </w:r>
+      <w:r>
+        <w:rPr>
+          <w:rFonts w:ascii="Arial" w:cs="Arial" w:eastAsia="Arial" w:hAnsi="Arial"/>
+          <w:color w:val="111111"/>
+          <w:sz w:val="19"/>
+          <w:szCs w:val="19"/>
+        </w:rPr>
+        <w:t xml:space="preserve"> Para cada variable categórica, calculá qué proporción de casos tiene resultado 1 (la variable objetivo) en cada categoría y comparala con la proporción general. ¿Alguna se despega claramente? Fijate también cuántos casos tiene cada grupo: una diferencia en un grupo muy chico puede ser casualidad.</w:t>
+      </w:r>
+    </w:p>
+    <w:p>
+      <w:pPr>
+        <w:keepLines/>
+        <w:spacing w:after="50" w:before="120" w:line="262"/>
+      </w:pPr>
+      <w:r>
+        <w:rPr>
+          <w:rFonts w:ascii="Arial" w:cs="Arial" w:eastAsia="Arial" w:hAnsi="Arial"/>
+          <w:b/>
+          <w:bCs/>
+          <w:color w:val="111111"/>
+          <w:sz w:val="19"/>
+          <w:szCs w:val="19"/>
+        </w:rPr>
+        <w:t xml:space="preserve">2. ¿Y en las variables numéricas?</w:t>
+      </w:r>
+      <w:r>
+        <w:rPr>
+          <w:rFonts w:ascii="Arial" w:cs="Arial" w:eastAsia="Arial" w:hAnsi="Arial"/>
+          <w:color w:val="111111"/>
+          <w:sz w:val="19"/>
+          <w:szCs w:val="19"/>
+        </w:rPr>
+        <w:t xml:space="preserve"> Dividilas en tramos (por ejemplo, cuartiles) y mirá si la proporción de 1 sube, baja o se mantiene. ¿El cambio es gradual o aparece de golpe a partir de cierto punto?</w:t>
+      </w:r>
+    </w:p>
+    <w:p>
+      <w:pPr>
+        <w:keepLines/>
+        <w:spacing w:after="50" w:before="120" w:line="262"/>
+      </w:pPr>
+      <w:r>
+        <w:rPr>
+          <w:rFonts w:ascii="Arial" w:cs="Arial" w:eastAsia="Arial" w:hAnsi="Arial"/>
+          <w:b/>
+          <w:bCs/>
+          <w:color w:val="111111"/>
+          <w:sz w:val="19"/>
+          <w:szCs w:val="19"/>
+        </w:rPr>
+        <w:t xml:space="preserve">3. ¿Qué información esconde una fecha?</w:t>
+      </w:r>
+      <w:r>
+        <w:rPr>
+          <w:rFonts w:ascii="Arial" w:cs="Arial" w:eastAsia="Arial" w:hAnsi="Arial"/>
+          <w:color w:val="111111"/>
+          <w:sz w:val="19"/>
+          <w:szCs w:val="19"/>
+        </w:rPr>
+        <w:t xml:space="preserve"> Una fecha y hora no es una sola variable. ¿Qué otras variables se pueden construir a partir de ella? ¿El momento en que ocurre el evento hace alguna diferencia?</w:t>
+      </w:r>
+    </w:p>
+    <w:p>
+      <w:pPr>
+        <w:keepLines/>
+        <w:spacing w:after="50" w:before="120" w:line="262"/>
+      </w:pPr>
+      <w:r>
+        <w:rPr>
+          <w:rFonts w:ascii="Arial" w:cs="Arial" w:eastAsia="Arial" w:hAnsi="Arial"/>
+          <w:b/>
+          <w:bCs/>
+          <w:color w:val="111111"/>
+          <w:sz w:val="19"/>
+          <w:szCs w:val="19"/>
+        </w:rPr>
+        <w:t xml:space="preserve">4. ¿Qué pasa al combinar dos variables?</w:t>
+      </w:r>
+      <w:r>
+        <w:rPr>
+          <w:rFonts w:ascii="Arial" w:cs="Arial" w:eastAsia="Arial" w:hAnsi="Arial"/>
+          <w:color w:val="111111"/>
+          <w:sz w:val="19"/>
+          <w:szCs w:val="19"/>
+        </w:rPr>
+        <w:t xml:space="preserve"> Hay grupos que solos no llaman la atención, pero combinados sí. Cruzá las variables de a dos y mirá la proporción de 1 en cada combinación (tabla cruzada o mapa de calor). ¿Hay algún rincón donde el resultado es muy distinto al resto?</w:t>
+      </w:r>
+    </w:p>
+    <w:p>
+      <w:pPr>
+        <w:keepLines/>
+        <w:spacing w:after="50" w:before="120" w:line="262"/>
+      </w:pPr>
+      <w:r>
+        <w:rPr>
+          <w:rFonts w:ascii="Arial" w:cs="Arial" w:eastAsia="Arial" w:hAnsi="Arial"/>
+          <w:b/>
+          <w:bCs/>
+          <w:color w:val="111111"/>
+          <w:sz w:val="19"/>
+          <w:szCs w:val="19"/>
+        </w:rPr>
+        <w:t xml:space="preserve">5. ¿Qué variables no aportan?</w:t>
+      </w:r>
+      <w:r>
+        <w:rPr>
+          <w:rFonts w:ascii="Arial" w:cs="Arial" w:eastAsia="Arial" w:hAnsi="Arial"/>
+          <w:color w:val="111111"/>
+          <w:sz w:val="19"/>
+          <w:szCs w:val="19"/>
+        </w:rPr>
+        <w:t xml:space="preserve"> Descartar variables también es un hallazgo. ¿Cuáles no muestran ninguna relación con el resultado, ni solas ni combinadas? ¿Cómo lo comprobaron?</w:t>
+      </w:r>
+    </w:p>
+    <w:p>
+      <w:pPr>
+        <w:keepLines/>
+        <w:spacing w:after="50" w:before="120" w:line="262"/>
+      </w:pPr>
+      <w:r>
+        <w:rPr>
+          <w:rFonts w:ascii="Arial" w:cs="Arial" w:eastAsia="Arial" w:hAnsi="Arial"/>
+          <w:b/>
+          <w:bCs/>
+          <w:color w:val="111111"/>
+          <w:sz w:val="19"/>
+          <w:szCs w:val="19"/>
+        </w:rPr>
+        <w:t xml:space="preserve">6. ¿Cuándo se conoce cada variable?</w:t>
+      </w:r>
+      <w:r>
+        <w:rPr>
+          <w:rFonts w:ascii="Arial" w:cs="Arial" w:eastAsia="Arial" w:hAnsi="Arial"/>
+          <w:color w:val="111111"/>
+          <w:sz w:val="19"/>
+          <w:szCs w:val="19"/>
+        </w:rPr>
+        <w:t xml:space="preserve"> Para cada una, preguntate si ya la tendrías en el momento de tomar la decisión de negocio. Si no la tendrías, ¿tiene sentido usarla para predecir? Comparen también qué columnas trae cada archivo.</w:t>
+      </w:r>
+    </w:p>
+    <w:p>
+      <w:pPr>
+        <w:keepLines/>
+        <w:spacing w:after="50" w:before="120" w:line="262"/>
+      </w:pPr>
+      <w:r>
+        <w:rPr>
+          <w:rFonts w:ascii="Arial" w:cs="Arial" w:eastAsia="Arial" w:hAnsi="Arial"/>
+          <w:b/>
+          <w:bCs/>
+          <w:color w:val="111111"/>
+          <w:sz w:val="19"/>
+          <w:szCs w:val="19"/>
+        </w:rPr>
+        <w:t xml:space="preserve">7. ¿Qué tienen de raro los datos?</w:t>
+      </w:r>
+      <w:r>
+        <w:rPr>
+          <w:rFonts w:ascii="Arial" w:cs="Arial" w:eastAsia="Arial" w:hAnsi="Arial"/>
+          <w:color w:val="111111"/>
+          <w:sz w:val="19"/>
+          <w:szCs w:val="19"/>
+        </w:rPr>
+        <w:t xml:space="preserve"> Valores faltantes, extremos o imposibles: ¿están repartidos al azar o concentrados en algún tipo de caso? ¿Distorsionan los promedios o los gráficos? ¿Qué harían con ellos y por qué?</w:t>
+      </w:r>
+    </w:p>
+    <w:p>
+      <w:pPr>
+        <w:keepLines/>
+        <w:spacing w:after="50" w:before="120" w:line="262"/>
+      </w:pPr>
+      <w:r>
+        <w:rPr>
+          <w:rFonts w:ascii="Arial" w:cs="Arial" w:eastAsia="Arial" w:hAnsi="Arial"/>
+          <w:b/>
+          <w:bCs/>
+          <w:color w:val="111111"/>
+          <w:sz w:val="19"/>
+          <w:szCs w:val="19"/>
+        </w:rPr>
+        <w:t xml:space="preserve">8. ¿Cuánto importa cada hallazgo?</w:t>
+      </w:r>
+      <w:r>
+        <w:rPr>
+          <w:rFonts w:ascii="Arial" w:cs="Arial" w:eastAsia="Arial" w:hAnsi="Arial"/>
+          <w:color w:val="111111"/>
+          <w:sz w:val="19"/>
+          <w:szCs w:val="19"/>
+        </w:rPr>
+        <w:t xml:space="preserve"> Para cada patrón: ¿cuántos casos abarca?, ¿cuánto cambia la proporción de 1?, ¿qué decisión del negocio cambia? Quédense con los que más mueven la aguja y contalos en términos del problema, no solo de los datos.</w:t>
+      </w:r>
+    </w:p>
+    <w:p>
+      <w:pPr>
+        <w:keepNext/>
+        <w:spacing w:after="60" w:before="220"/>
+      </w:pPr>
+      <w:r>
+        <w:rPr>
+          <w:rFonts w:ascii="Arial" w:cs="Arial" w:eastAsia="Arial" w:hAnsi="Arial"/>
+          <w:b/>
+          <w:bCs/>
+          <w:color w:val="111111"/>
+          <w:spacing w:val="24"/>
+          <w:sz w:val="16"/>
+          <w:szCs w:val="16"/>
+        </w:rPr>
+        <w:t xml:space="preserve">CÓMO PEDÍRSELO A CLAUDE</w:t>
+      </w:r>
+    </w:p>
+    <w:p>
+      <w:pPr>
+        <w:keepLines/>
+        <w:pBdr>
+          <w:left w:val="single" w:color="A100FF" w:sz="12" w:space="8"/>
+        </w:pBdr>
+        <w:spacing w:after="60" w:line="250"/>
+        <w:ind w:left="240"/>
+      </w:pPr>
+      <w:r>
+        <w:rPr>
+          <w:rFonts w:ascii="Arial" w:cs="Arial" w:eastAsia="Arial" w:hAnsi="Arial"/>
+          <w:b/>
+          <w:bCs/>
+          <w:color w:val="555555"/>
+          <w:sz w:val="18"/>
+          <w:szCs w:val="18"/>
+        </w:rPr>
+        <w:t xml:space="preserve">Ejemplo: </w:t>
+      </w:r>
+      <w:r>
+        <w:rPr>
+          <w:rFonts w:ascii="Arial" w:cs="Arial" w:eastAsia="Arial" w:hAnsi="Arial"/>
+          <w:i/>
+          <w:iCs/>
+          <w:color w:val="111111"/>
+          <w:sz w:val="18"/>
+          <w:szCs w:val="18"/>
+        </w:rPr>
+        <w:t xml:space="preserve">“Para cada variable, calculá la proporción de casos con resultado 1 por categoría o por tramo. Ordenalas de la que más se despega de la proporción general a la que menos, y mostrame cuántos casos tiene cada grupo.”</w:t>
+      </w:r>
+    </w:p>
+    <w:p>
+      <w:pPr>
+        <w:keepLines/>
+        <w:pBdr>
+          <w:left w:val="single" w:color="A100FF" w:sz="12" w:space="8"/>
+        </w:pBdr>
+        <w:spacing w:after="60" w:line="250"/>
+        <w:ind w:left="240"/>
+      </w:pPr>
+      <w:r>
+        <w:rPr>
+          <w:rFonts w:ascii="Arial" w:cs="Arial" w:eastAsia="Arial" w:hAnsi="Arial"/>
+          <w:b/>
+          <w:bCs/>
+          <w:color w:val="555555"/>
+          <w:sz w:val="18"/>
+          <w:szCs w:val="18"/>
+        </w:rPr>
+        <w:t xml:space="preserve">Ejemplo: </w:t>
+      </w:r>
+      <w:r>
+        <w:rPr>
+          <w:rFonts w:ascii="Arial" w:cs="Arial" w:eastAsia="Arial" w:hAnsi="Arial"/>
+          <w:i/>
+          <w:iCs/>
+          <w:color w:val="111111"/>
+          <w:sz w:val="18"/>
+          <w:szCs w:val="18"/>
+        </w:rPr>
+        <w:t xml:space="preserve">“Sacá de la fecha todas las variables que se te ocurran y decime si alguna cambia la proporción de 1.”</w:t>
+      </w:r>
+    </w:p>
+    <w:p>
+      <w:pPr>
+        <w:keepLines/>
+        <w:pBdr>
+          <w:left w:val="single" w:color="A100FF" w:sz="12" w:space="8"/>
+        </w:pBdr>
+        <w:spacing w:after="60" w:line="250"/>
+        <w:ind w:left="240"/>
+      </w:pPr>
+      <w:r>
+        <w:rPr>
+          <w:rFonts w:ascii="Arial" w:cs="Arial" w:eastAsia="Arial" w:hAnsi="Arial"/>
+          <w:b/>
+          <w:bCs/>
+          <w:color w:val="555555"/>
+          <w:sz w:val="18"/>
+          <w:szCs w:val="18"/>
+        </w:rPr>
+        <w:t xml:space="preserve">Ejemplo: </w:t>
+      </w:r>
+      <w:r>
+        <w:rPr>
+          <w:rFonts w:ascii="Arial" w:cs="Arial" w:eastAsia="Arial" w:hAnsi="Arial"/>
+          <w:i/>
+          <w:iCs/>
+          <w:color w:val="111111"/>
+          <w:sz w:val="18"/>
+          <w:szCs w:val="18"/>
+        </w:rPr>
+        <w:t xml:space="preserve">“Cruzá de a dos las variables más relevantes y mostrame las combinaciones donde la proporción de 1 es muy distinta de la general, con la cantidad de casos de cada una.”</w:t>
       </w:r>
     </w:p>
     <w:sectPr>

</xml_diff>